<commit_message>
feat: voice call, global call screen, chat notifications, UI fixes
- Add WebRTC voice call between staff and customer with global incoming call screen
- Add CallRingtoneService with native ringtone + vibration (VIBRATE permission)
- GlobalCallListener auto-pushes /call route from any screen
- Fix GoRouter redirect blocking staff from accessing /call route
- Fix ICE candidate race condition with pending queue in CallService
- Customer receives native notification when staff accepts request (polling fallback)
- Customer receives chat notification when outside chat room via per-room WebSocket
- Staff chat messages dedup by content+senderRole+timestamp
- Fix optimistic message senderRole (empty → correct role) for proper bubble color
- Fix UI overflow in booking management and staff chat screens
- Update AGENTS.md with call system and notification architecture
- Update graduation project documentation with voice call and notification features
</commit_message>
<xml_diff>
--- a/Documentations/BaoCao_DoAnTotNghiep_ChatbotAI.docx
+++ b/Documentations/BaoCao_DoAnTotNghiep_ChatbotAI.docx
@@ -8629,6 +8629,151 @@
         <w:br/>
       </w:r>
     </w:p>
+    <w:p>
+      <w:pPr>
+        <w:pStyle w:val="Normal"/>
+        <w:shd w:val="clear" w:color="auto" w:fill="F5F5F5"/>
+        <w:spacing w:before="40" w:after="120" w:line="276" w:lineRule="auto"/>
+      </w:pPr>
+      <w:r>
+        <w:t>Use Case - Gọi thoại (Voice Call):</w:t>
+      </w:r>
+    </w:p>
+    <w:p>
+      <w:pPr>
+        <w:pStyle w:val="Normal"/>
+        <w:shd w:val="clear" w:color="auto" w:fill="F5F5F5"/>
+        <w:spacing w:before="40" w:after="120" w:line="276" w:lineRule="auto"/>
+      </w:pPr>
+      <w:r>
+        <w:t>Mermaid code (copy để generate hình):</w:t>
+      </w:r>
+    </w:p>
+    <w:p>
+      <w:pPr>
+        <w:pStyle w:val="Normal"/>
+        <w:shd w:val="clear" w:color="auto" w:fill="F5F5F5"/>
+        <w:spacing w:before="40" w:after="120" w:line="276" w:lineRule="auto"/>
+      </w:pPr>
+      <w:r>
+        <w:t>graph LR</w:t>
+      </w:r>
+    </w:p>
+    <w:p>
+      <w:pPr>
+        <w:pStyle w:val="Normal"/>
+        <w:shd w:val="clear" w:color="auto" w:fill="F5F5F5"/>
+        <w:spacing w:before="40" w:after="120" w:line="276" w:lineRule="auto"/>
+      </w:pPr>
+      <w:r>
+        <w:t xml:space="preserve">    Customer((Customer))</w:t>
+      </w:r>
+    </w:p>
+    <w:p>
+      <w:pPr>
+        <w:pStyle w:val="Normal"/>
+        <w:shd w:val="clear" w:color="auto" w:fill="F5F5F5"/>
+        <w:spacing w:before="40" w:after="120" w:line="276" w:lineRule="auto"/>
+      </w:pPr>
+      <w:r>
+        <w:t xml:space="preserve">    Staff((Staff))</w:t>
+      </w:r>
+    </w:p>
+    <w:p>
+      <w:pPr>
+        <w:pStyle w:val="Normal"/>
+        <w:shd w:val="clear" w:color="auto" w:fill="F5F5F5"/>
+        <w:spacing w:before="40" w:after="120" w:line="276" w:lineRule="auto"/>
+      </w:pPr>
+      <w:r>
+        <w:t xml:space="preserve">    System((Hệ thống))</w:t>
+      </w:r>
+    </w:p>
+    <w:p>
+      <w:pPr>
+        <w:pStyle w:val="Normal"/>
+        <w:shd w:val="clear" w:color="auto" w:fill="F5F5F5"/>
+        <w:spacing w:before="40" w:after="120" w:line="276" w:lineRule="auto"/>
+      </w:pPr>
+      <w:r/>
+    </w:p>
+    <w:p>
+      <w:pPr>
+        <w:pStyle w:val="Normal"/>
+        <w:shd w:val="clear" w:color="auto" w:fill="F5F5F5"/>
+        <w:spacing w:before="40" w:after="120" w:line="276" w:lineRule="auto"/>
+      </w:pPr>
+      <w:r>
+        <w:t xml:space="preserve">    Customer --&gt;|Bấm gọi| UC_VC1[UC: Gọi thoại]</w:t>
+      </w:r>
+    </w:p>
+    <w:p>
+      <w:pPr>
+        <w:pStyle w:val="Normal"/>
+        <w:shd w:val="clear" w:color="auto" w:fill="F5F5F5"/>
+        <w:spacing w:before="40" w:after="120" w:line="276" w:lineRule="auto"/>
+      </w:pPr>
+      <w:r>
+        <w:t xml:space="preserve">    UC_VC1 --&gt; System</w:t>
+      </w:r>
+    </w:p>
+    <w:p>
+      <w:pPr>
+        <w:pStyle w:val="Normal"/>
+        <w:shd w:val="clear" w:color="auto" w:fill="F5F5F5"/>
+        <w:spacing w:before="40" w:after="120" w:line="276" w:lineRule="auto"/>
+      </w:pPr>
+      <w:r>
+        <w:t xml:space="preserve">    System --&gt;|WebRTC offer| Staff</w:t>
+      </w:r>
+    </w:p>
+    <w:p>
+      <w:pPr>
+        <w:pStyle w:val="Normal"/>
+        <w:shd w:val="clear" w:color="auto" w:fill="F5F5F5"/>
+        <w:spacing w:before="40" w:after="120" w:line="276" w:lineRule="auto"/>
+      </w:pPr>
+      <w:r>
+        <w:t xml:space="preserve">    Staff --&gt;|Bấm nghe| UC_VC2[UC: Chấp nhận cuộc gọi]</w:t>
+      </w:r>
+    </w:p>
+    <w:p>
+      <w:pPr>
+        <w:pStyle w:val="Normal"/>
+        <w:shd w:val="clear" w:color="auto" w:fill="F5F5F5"/>
+        <w:spacing w:before="40" w:after="120" w:line="276" w:lineRule="auto"/>
+      </w:pPr>
+      <w:r>
+        <w:t xml:space="preserve">    UC_VC2 --&gt; System</w:t>
+      </w:r>
+    </w:p>
+    <w:p>
+      <w:pPr>
+        <w:pStyle w:val="Normal"/>
+        <w:shd w:val="clear" w:color="auto" w:fill="F5F5F5"/>
+        <w:spacing w:before="40" w:after="120" w:line="276" w:lineRule="auto"/>
+      </w:pPr>
+      <w:r>
+        <w:t xml:space="preserve">    System --&gt;|WebRTC P2P| Customer</w:t>
+      </w:r>
+    </w:p>
+    <w:p>
+      <w:pPr>
+        <w:pStyle w:val="Normal"/>
+        <w:shd w:val="clear" w:color="auto" w:fill="F5F5F5"/>
+        <w:spacing w:before="40" w:after="120" w:line="276" w:lineRule="auto"/>
+      </w:pPr>
+      <w:r>
+        <w:t xml:space="preserve">    Staff --&gt;|Kết thúc| UC_VC3[UC: Kết thúc cuộc gọi]</w:t>
+      </w:r>
+    </w:p>
+    <w:p>
+      <w:pPr>
+        <w:shd w:val="clear" w:color="auto" w:fill="F5F5F5"/>
+        <w:spacing w:before="40" w:after="120" w:line="276" w:lineRule="auto"/>
+      </w:pPr>
+      <w:r/>
+    </w:p>
     <w:p/>
     <w:p>
       <w:pPr>
@@ -10854,6 +10999,333 @@
         </w:rPr>
         <w:br/>
       </w:r>
+    </w:p>
+    <w:p>
+      <w:pPr>
+        <w:pStyle w:val="Normal"/>
+        <w:shd w:val="clear" w:color="auto" w:fill="F5F5F5"/>
+        <w:spacing w:before="40" w:after="120" w:line="276" w:lineRule="auto"/>
+      </w:pPr>
+      <w:r>
+        <w:t>Sequence - Gọi thoại (Voice Call):</w:t>
+      </w:r>
+    </w:p>
+    <w:p>
+      <w:pPr>
+        <w:pStyle w:val="Normal"/>
+        <w:shd w:val="clear" w:color="auto" w:fill="F5F5F5"/>
+        <w:spacing w:before="40" w:after="120" w:line="276" w:lineRule="auto"/>
+      </w:pPr>
+      <w:r>
+        <w:t>Mermaid code (copy để generate hình):</w:t>
+      </w:r>
+    </w:p>
+    <w:p>
+      <w:pPr>
+        <w:pStyle w:val="Normal"/>
+        <w:shd w:val="clear" w:color="auto" w:fill="F5F5F5"/>
+        <w:spacing w:before="40" w:after="120" w:line="276" w:lineRule="auto"/>
+      </w:pPr>
+      <w:r>
+        <w:t>sequenceDiagram</w:t>
+      </w:r>
+    </w:p>
+    <w:p>
+      <w:pPr>
+        <w:pStyle w:val="Normal"/>
+        <w:shd w:val="clear" w:color="auto" w:fill="F5F5F5"/>
+        <w:spacing w:before="40" w:after="120" w:line="276" w:lineRule="auto"/>
+      </w:pPr>
+      <w:r>
+        <w:t xml:space="preserve">    participant C as Customer</w:t>
+      </w:r>
+    </w:p>
+    <w:p>
+      <w:pPr>
+        <w:pStyle w:val="Normal"/>
+        <w:shd w:val="clear" w:color="auto" w:fill="F5F5F5"/>
+        <w:spacing w:before="40" w:after="120" w:line="276" w:lineRule="auto"/>
+      </w:pPr>
+      <w:r>
+        <w:t xml:space="preserve">    participant CW as Chat WebSocket</w:t>
+      </w:r>
+    </w:p>
+    <w:p>
+      <w:pPr>
+        <w:pStyle w:val="Normal"/>
+        <w:shd w:val="clear" w:color="auto" w:fill="F5F5F5"/>
+        <w:spacing w:before="40" w:after="120" w:line="276" w:lineRule="auto"/>
+      </w:pPr>
+      <w:r>
+        <w:t xml:space="preserve">    participant B as Backend</w:t>
+      </w:r>
+    </w:p>
+    <w:p>
+      <w:pPr>
+        <w:pStyle w:val="Normal"/>
+        <w:shd w:val="clear" w:color="auto" w:fill="F5F5F5"/>
+        <w:spacing w:before="40" w:after="120" w:line="276" w:lineRule="auto"/>
+      </w:pPr>
+      <w:r>
+        <w:t xml:space="preserve">    participant SW as Staff Chat WS</w:t>
+      </w:r>
+    </w:p>
+    <w:p>
+      <w:pPr>
+        <w:pStyle w:val="Normal"/>
+        <w:shd w:val="clear" w:color="auto" w:fill="F5F5F5"/>
+        <w:spacing w:before="40" w:after="120" w:line="276" w:lineRule="auto"/>
+      </w:pPr>
+      <w:r>
+        <w:t xml:space="preserve">    participant S as Staff</w:t>
+      </w:r>
+    </w:p>
+    <w:p>
+      <w:pPr>
+        <w:pStyle w:val="Normal"/>
+        <w:shd w:val="clear" w:color="auto" w:fill="F5F5F5"/>
+        <w:spacing w:before="40" w:after="120" w:line="276" w:lineRule="auto"/>
+      </w:pPr>
+      <w:r>
+        <w:t xml:space="preserve">    participant CP as CallProvider</w:t>
+      </w:r>
+    </w:p>
+    <w:p>
+      <w:pPr>
+        <w:pStyle w:val="Normal"/>
+        <w:shd w:val="clear" w:color="auto" w:fill="F5F5F5"/>
+        <w:spacing w:before="40" w:after="120" w:line="276" w:lineRule="auto"/>
+      </w:pPr>
+      <w:r/>
+    </w:p>
+    <w:p>
+      <w:pPr>
+        <w:pStyle w:val="Normal"/>
+        <w:shd w:val="clear" w:color="auto" w:fill="F5F5F5"/>
+        <w:spacing w:before="40" w:after="120" w:line="276" w:lineRule="auto"/>
+      </w:pPr>
+      <w:r>
+        <w:t xml:space="preserve">    Note over C,S: Staff mở phòng chat -&gt; Signaling gắn ở provider level</w:t>
+      </w:r>
+    </w:p>
+    <w:p>
+      <w:pPr>
+        <w:pStyle w:val="Normal"/>
+        <w:shd w:val="clear" w:color="auto" w:fill="F5F5F5"/>
+        <w:spacing w:before="40" w:after="120" w:line="276" w:lineRule="auto"/>
+      </w:pPr>
+      <w:r/>
+    </w:p>
+    <w:p>
+      <w:pPr>
+        <w:pStyle w:val="Normal"/>
+        <w:shd w:val="clear" w:color="auto" w:fill="F5F5F5"/>
+        <w:spacing w:before="40" w:after="120" w:line="276" w:lineRule="auto"/>
+      </w:pPr>
+      <w:r>
+        <w:t xml:space="preserve">    C-&gt;&gt;CW: Bấm gọi (startCall)</w:t>
+      </w:r>
+    </w:p>
+    <w:p>
+      <w:pPr>
+        <w:pStyle w:val="Normal"/>
+        <w:shd w:val="clear" w:color="auto" w:fill="F5F5F5"/>
+        <w:spacing w:before="40" w:after="120" w:line="276" w:lineRule="auto"/>
+      </w:pPr>
+      <w:r>
+        <w:t xml:space="preserve">    CW-&gt;&gt;SW: {type: call_offer, sdp}</w:t>
+      </w:r>
+    </w:p>
+    <w:p>
+      <w:pPr>
+        <w:pStyle w:val="Normal"/>
+        <w:shd w:val="clear" w:color="auto" w:fill="F5F5F5"/>
+        <w:spacing w:before="40" w:after="120" w:line="276" w:lineRule="auto"/>
+      </w:pPr>
+      <w:r>
+        <w:t xml:space="preserve">    SW-&gt;&gt;CP: handleSignalingMessage(call_offer)</w:t>
+      </w:r>
+    </w:p>
+    <w:p>
+      <w:pPr>
+        <w:pStyle w:val="Normal"/>
+        <w:shd w:val="clear" w:color="auto" w:fill="F5F5F5"/>
+        <w:spacing w:before="40" w:after="120" w:line="276" w:lineRule="auto"/>
+      </w:pPr>
+      <w:r>
+        <w:t xml:space="preserve">    CP-&gt;&gt;CP: state = incomingRinging</w:t>
+      </w:r>
+    </w:p>
+    <w:p>
+      <w:pPr>
+        <w:pStyle w:val="Normal"/>
+        <w:shd w:val="clear" w:color="auto" w:fill="F5F5F5"/>
+        <w:spacing w:before="40" w:after="120" w:line="276" w:lineRule="auto"/>
+      </w:pPr>
+      <w:r>
+        <w:t xml:space="preserve">    CP-&gt;&gt;S: GlobalCallListener push /call</w:t>
+      </w:r>
+    </w:p>
+    <w:p>
+      <w:pPr>
+        <w:pStyle w:val="Normal"/>
+        <w:shd w:val="clear" w:color="auto" w:fill="F5F5F5"/>
+        <w:spacing w:before="40" w:after="120" w:line="276" w:lineRule="auto"/>
+      </w:pPr>
+      <w:r>
+        <w:t xml:space="preserve">    S-&gt;&gt;S: Màn hình cuộc gọi + rung chuông</w:t>
+      </w:r>
+    </w:p>
+    <w:p>
+      <w:pPr>
+        <w:pStyle w:val="Normal"/>
+        <w:shd w:val="clear" w:color="auto" w:fill="F5F5F5"/>
+        <w:spacing w:before="40" w:after="120" w:line="276" w:lineRule="auto"/>
+      </w:pPr>
+      <w:r/>
+    </w:p>
+    <w:p>
+      <w:pPr>
+        <w:pStyle w:val="Normal"/>
+        <w:shd w:val="clear" w:color="auto" w:fill="F5F5F5"/>
+        <w:spacing w:before="40" w:after="120" w:line="276" w:lineRule="auto"/>
+      </w:pPr>
+      <w:r>
+        <w:t xml:space="preserve">    S-&gt;&gt;CP: Bấm "Nghe" (acceptCall)</w:t>
+      </w:r>
+    </w:p>
+    <w:p>
+      <w:pPr>
+        <w:pStyle w:val="Normal"/>
+        <w:shd w:val="clear" w:color="auto" w:fill="F5F5F5"/>
+        <w:spacing w:before="40" w:after="120" w:line="276" w:lineRule="auto"/>
+      </w:pPr>
+      <w:r>
+        <w:t xml:space="preserve">    CP-&gt;&gt;CP: createAnswer (WebRTC)</w:t>
+      </w:r>
+    </w:p>
+    <w:p>
+      <w:pPr>
+        <w:pStyle w:val="Normal"/>
+        <w:shd w:val="clear" w:color="auto" w:fill="F5F5F5"/>
+        <w:spacing w:before="40" w:after="120" w:line="276" w:lineRule="auto"/>
+      </w:pPr>
+      <w:r>
+        <w:t xml:space="preserve">    CP-&gt;&gt;SW: {type: call_answer, sdp}</w:t>
+      </w:r>
+    </w:p>
+    <w:p>
+      <w:pPr>
+        <w:pStyle w:val="Normal"/>
+        <w:shd w:val="clear" w:color="auto" w:fill="F5F5F5"/>
+        <w:spacing w:before="40" w:after="120" w:line="276" w:lineRule="auto"/>
+      </w:pPr>
+      <w:r>
+        <w:t xml:space="preserve">    SW-&gt;&gt;CW: call_answer</w:t>
+      </w:r>
+    </w:p>
+    <w:p>
+      <w:pPr>
+        <w:pStyle w:val="Normal"/>
+        <w:shd w:val="clear" w:color="auto" w:fill="F5F5F5"/>
+        <w:spacing w:before="40" w:after="120" w:line="276" w:lineRule="auto"/>
+      </w:pPr>
+      <w:r>
+        <w:t xml:space="preserve">    CW-&gt;&gt;C: WebRTC connected</w:t>
+      </w:r>
+    </w:p>
+    <w:p>
+      <w:pPr>
+        <w:pStyle w:val="Normal"/>
+        <w:shd w:val="clear" w:color="auto" w:fill="F5F5F5"/>
+        <w:spacing w:before="40" w:after="120" w:line="276" w:lineRule="auto"/>
+      </w:pPr>
+      <w:r/>
+    </w:p>
+    <w:p>
+      <w:pPr>
+        <w:pStyle w:val="Normal"/>
+        <w:shd w:val="clear" w:color="auto" w:fill="F5F5F5"/>
+        <w:spacing w:before="40" w:after="120" w:line="276" w:lineRule="auto"/>
+      </w:pPr>
+      <w:r>
+        <w:t xml:space="preserve">    Note over C,S: P2P audio stream (WebRTC)</w:t>
+      </w:r>
+    </w:p>
+    <w:p>
+      <w:pPr>
+        <w:pStyle w:val="Normal"/>
+        <w:shd w:val="clear" w:color="auto" w:fill="F5F5F5"/>
+        <w:spacing w:before="40" w:after="120" w:line="276" w:lineRule="auto"/>
+      </w:pPr>
+      <w:r/>
+    </w:p>
+    <w:p>
+      <w:pPr>
+        <w:pStyle w:val="Normal"/>
+        <w:shd w:val="clear" w:color="auto" w:fill="F5F5F5"/>
+        <w:spacing w:before="40" w:after="120" w:line="276" w:lineRule="auto"/>
+      </w:pPr>
+      <w:r>
+        <w:t xml:space="preserve">    S-&gt;&gt;CP: Bấm "Kết thúc" (endCall)</w:t>
+      </w:r>
+    </w:p>
+    <w:p>
+      <w:pPr>
+        <w:pStyle w:val="Normal"/>
+        <w:shd w:val="clear" w:color="auto" w:fill="F5F5F5"/>
+        <w:spacing w:before="40" w:after="120" w:line="276" w:lineRule="auto"/>
+      </w:pPr>
+      <w:r>
+        <w:t xml:space="preserve">    CP-&gt;&gt;SW: {type: call_end}</w:t>
+      </w:r>
+    </w:p>
+    <w:p>
+      <w:pPr>
+        <w:pStyle w:val="Normal"/>
+        <w:shd w:val="clear" w:color="auto" w:fill="F5F5F5"/>
+        <w:spacing w:before="40" w:after="120" w:line="276" w:lineRule="auto"/>
+      </w:pPr>
+      <w:r>
+        <w:t xml:space="preserve">    SW-&gt;&gt;CW: call_end</w:t>
+      </w:r>
+    </w:p>
+    <w:p>
+      <w:pPr>
+        <w:pStyle w:val="Normal"/>
+        <w:shd w:val="clear" w:color="auto" w:fill="F5F5F5"/>
+        <w:spacing w:before="40" w:after="120" w:line="276" w:lineRule="auto"/>
+      </w:pPr>
+      <w:r>
+        <w:t xml:space="preserve">    CW-&gt;&gt;C: Call ended</w:t>
+      </w:r>
+    </w:p>
+    <w:p>
+      <w:pPr>
+        <w:pStyle w:val="Normal"/>
+        <w:shd w:val="clear" w:color="auto" w:fill="F5F5F5"/>
+        <w:spacing w:before="40" w:after="120" w:line="276" w:lineRule="auto"/>
+      </w:pPr>
+      <w:r>
+        <w:t xml:space="preserve">    CP-&gt;&gt;CP: state = idle</w:t>
+      </w:r>
+    </w:p>
+    <w:p>
+      <w:pPr>
+        <w:pStyle w:val="Normal"/>
+        <w:shd w:val="clear" w:color="auto" w:fill="F5F5F5"/>
+        <w:spacing w:before="40" w:after="120" w:line="276" w:lineRule="auto"/>
+      </w:pPr>
+      <w:r>
+        <w:t xml:space="preserve">    CP-&gt;&gt;S: Auto pop /call screen</w:t>
+      </w:r>
+    </w:p>
+    <w:p>
+      <w:pPr>
+        <w:shd w:val="clear" w:color="auto" w:fill="F5F5F5"/>
+        <w:spacing w:before="40" w:after="120" w:line="276" w:lineRule="auto"/>
+      </w:pPr>
+      <w:r/>
     </w:p>
     <w:p/>
     <w:p>
@@ -22311,6 +22783,24 @@
     </w:p>
     <w:p>
       <w:pPr>
+        <w:pStyle w:val="ListBullet"/>
+        <w:spacing w:after="0"/>
+      </w:pPr>
+      <w:r>
+        <w:t>Call Feature: Cục gọi thoại real-time giữa nhân viên và khách hàng bằng WebRTC. Signaling đi qua WebSocket của phòng chat, xử lý ở provider level (không phụ thuộc screen) để nhận cuộc gọi từ mọi màn hình.</w:t>
+      </w:r>
+    </w:p>
+    <w:p>
+      <w:pPr>
+        <w:pStyle w:val="ListBullet"/>
+        <w:spacing w:after="0"/>
+      </w:pPr>
+      <w:r>
+        <w:t>Voice Agent Feature: Trò chuyện giọi nói với AI Agent sử dụng speech-to-text và text-to-speech. Hỗ trợ barge-in, tự động phát hiện ngôn ngữ (VI/EN).</w:t>
+      </w:r>
+    </w:p>
+    <w:p>
+      <w:pPr>
         <w:pStyle w:val="Heading3"/>
         <w:spacing w:before="240" w:after="120"/>
       </w:pPr>
@@ -22326,7 +22816,7 @@
         <w:spacing w:after="0"/>
       </w:pPr>
       <w:r>
-        <w:t>Ứng dụng sử dụng Riverpod để quản lý trạng thái. Riverpod cung cấp các ưu điểm: type-safe, testable, không phụ thuộc BuildContext. Các provider chính: AuthProvider, ChatProvider, BookingProvider, MenuProvider.</w:t>
+        <w:t>Ứng dụng sử dụng Riverpod để quản lý trạng thái. Riverpod cung cấp các ưu điểm: type-safe, testable, không phụ thuộc BuildContext. Các provider chính: AuthProvider, ChatProvider, BookingProvider, MenuProvider. CallProvider sử dụng pattern non-autoDispose để duy trì trạng thái cuộc gọi xuyên suốt phiên làm việc, cho phép nhận cuộc gọi đến từ bất kỳ màn hình nào. StaffChatProvider (family) tự động gắn call signaling khi được tạo.</w:t>
       </w:r>
     </w:p>
     <w:p>
@@ -22346,7 +22836,7 @@
         <w:spacing w:after="0"/>
       </w:pPr>
       <w:r>
-        <w:t>Điều hướng trong ứng dụng sử dụng GoRouter, hỗ trợ declarative routing và deep linking. Các route chính: /login, /home, /chat, /booking, /menu, /profile.</w:t>
+        <w:t>Điều hướng trong ứng dụng sử dụng GoRouter, hỗ trợ declarative routing và deep linking. Các route chính: /login, /home, /chat, /booking, /menu, /profile, /call (màn hình cuộc gọi toàn cục), /voice-agent (voice chat với AI), /staff-chat/:requestId, /staff-operator-chat/:requestId. GlobalCallListener trong MaterialApp.builder tự động push route /call khi có cuộc gọi đến.</w:t>
       </w:r>
     </w:p>
     <w:p>
@@ -22932,7 +23422,7 @@
         <w:spacing w:after="0"/>
       </w:pPr>
       <w:r>
-        <w:t>Giao diện chat thời gian thực giữa khách hàng và nhân viên. Sử dụng WebSocket để truyền tin nhắn tức thì. Hỗ trợ hiển thị tin nhắn, thời gian gửi, và trạng thái đối phương online.</w:t>
+        <w:t>Giao diện chat thời gian thực giữa khách hàng và nhân viên. Sử dụng WebSocket để truyền tin nhắn tức thì. Hỗ trợ hiển thịn tin nhắn, thời gian gửi, và trạng thái đối phương online. Tích hợp gọi thoại (voice call) bằng WebRTC, signaling đi qua cùng WebSocket. Khi có cuộc gọi đến, hệ thống tự động hiển thịn màn hình cuộc gọi toàn cục với rung + chuông.</w:t>
       </w:r>
     </w:p>
     <w:p>
@@ -23752,6 +24242,33 @@
         <w:spacing w:after="0"/>
       </w:pPr>
       <w:r>
+        <w:t>Chức năng gọi thoại (voice call) hoạt động giữa nhân viên và khách hàng bằng WebRTC, có rung chuông khi có cuộc gọi đến.</w:t>
+      </w:r>
+    </w:p>
+    <w:p>
+      <w:pPr>
+        <w:pStyle w:val="ListBullet"/>
+        <w:spacing w:after="0"/>
+      </w:pPr>
+      <w:r>
+        <w:t>Voice Agent cho phép khách hàng trò chuyện giọi nói với AI Agent (speech-to-text + text-to-speech), hỗ trợ barge-in.</w:t>
+      </w:r>
+    </w:p>
+    <w:p>
+      <w:pPr>
+        <w:pStyle w:val="ListBullet"/>
+        <w:spacing w:after="0"/>
+      </w:pPr>
+      <w:r>
+        <w:t>Hệ thống thông báo real-time cho khách hàng khi nhân viên tiếp nhận yêu cầu (không cần polling).</w:t>
+      </w:r>
+    </w:p>
+    <w:p>
+      <w:pPr>
+        <w:pStyle w:val="ListBullet"/>
+        <w:spacing w:after="0"/>
+      </w:pPr>
+      <w:r>
         <w:lastRenderedPageBreak/>
         <w:t>Admin quản lý giá dịch vụ, xem hóa đơn chi tiết booking với tổng tiền.</w:t>
       </w:r>
@@ -23802,7 +24319,7 @@
         <w:spacing w:after="0"/>
       </w:pPr>
       <w:r>
-        <w:t>Hỗ trợ voice chat (speech-to-text, text-to-speech).</w:t>
+        <w:t>Mở rộng voice call: gọi video, chia sẻ màn hình, ghi âm cuộc gọi.</w:t>
       </w:r>
     </w:p>
     <w:p>

</xml_diff>